<commit_message>
Completed multiple  merge functions.
</commit_message>
<xml_diff>
--- a/project/documents/letters/PCTReportOutPublishedApplication.docx
+++ b/project/documents/letters/PCTReportOutPublishedApplication.docx
@@ -4,235 +4,102 @@
   <w:body>
     <w:p>
       <w:pPr>
-        <w:tabs>
-          <w:tab w:val="right" w:pos="9360"/>
-        </w:tabs>
-        <w:rPr>
-          <w:b/>
-          <w:bCs/>
-          <w:sz w:val="24"/>
-        </w:rPr>
-      </w:pPr>
-    </w:p>
-    <w:p>
-      <w:pPr>
-        <w:tabs>
-          <w:tab w:val="right" w:pos="9360"/>
-        </w:tabs>
-        <w:rPr>
-          <w:b/>
-          <w:bCs/>
-          <w:sz w:val="24"/>
-        </w:rPr>
-      </w:pPr>
-    </w:p>
-    <w:p>
-      <w:pPr>
-        <w:tabs>
-          <w:tab w:val="right" w:pos="9360"/>
-        </w:tabs>
-        <w:rPr>
-          <w:b/>
-          <w:bCs/>
-          <w:sz w:val="24"/>
-        </w:rPr>
-      </w:pPr>
-    </w:p>
-    <w:p>
-      <w:pPr>
-        <w:tabs>
-          <w:tab w:val="right" w:pos="9360"/>
-        </w:tabs>
-        <w:rPr>
-          <w:b/>
-          <w:bCs/>
-          <w:sz w:val="24"/>
-        </w:rPr>
-      </w:pPr>
-    </w:p>
-    <w:p>
-      <w:pPr>
-        <w:tabs>
-          <w:tab w:val="right" w:pos="9360"/>
-        </w:tabs>
-        <w:rPr>
-          <w:b/>
-          <w:bCs/>
-          <w:szCs w:val="20"/>
-        </w:rPr>
-      </w:pPr>
-      <w:r>
-        <w:rPr>
-          <w:b/>
-          <w:bCs/>
-          <w:szCs w:val="20"/>
-        </w:rPr>
-        <w:t>&lt;&lt;WAName&gt;&gt; &lt;&lt;WAPhone&gt;&gt;</w:t>
-      </w:r>
-      <w:r>
-        <w:rPr>
-          <w:b/>
-          <w:bCs/>
-          <w:szCs w:val="20"/>
-        </w:rPr>
-        <w:t xml:space="preserve"> </w:t>
-      </w:r>
-      <w:r>
-        <w:rPr>
-          <w:b/>
-          <w:bCs/>
-          <w:szCs w:val="20"/>
-        </w:rPr>
-        <w:t>&lt;&lt;WAEmail&gt;&gt;</w:t>
-      </w:r>
-    </w:p>
-    <w:p>
-      <w:pPr>
-        <w:tabs>
-          <w:tab w:val="right" w:pos="9360"/>
-        </w:tabs>
-        <w:rPr>
-          <w:szCs w:val="20"/>
-        </w:rPr>
-      </w:pPr>
-      <w:r>
-        <w:rPr>
-          <w:b/>
-          <w:bCs/>
-          <w:szCs w:val="20"/>
-        </w:rPr>
-        <w:t>&lt;&lt;paraName&gt;&gt; &lt;&lt;paraPhone&gt;&gt;</w:t>
-      </w:r>
-      <w:r>
-        <w:rPr>
-          <w:b/>
-          <w:bCs/>
-          <w:szCs w:val="20"/>
-        </w:rPr>
-        <w:t xml:space="preserve"> </w:t>
-      </w:r>
-      <w:r>
-        <w:rPr>
-          <w:b/>
-          <w:bCs/>
-          <w:szCs w:val="20"/>
-        </w:rPr>
-        <w:t>&lt;&lt;paraEmail&gt;&gt;</w:t>
-      </w:r>
-    </w:p>
-    <w:p>
-      <w:pPr>
-        <w:rPr>
-          <w:b/>
-          <w:bCs/>
-          <w:sz w:val="24"/>
-        </w:rPr>
-      </w:pPr>
-    </w:p>
-    <w:p>
-      <w:pPr>
-        <w:rPr>
-          <w:sz w:val="24"/>
-        </w:rPr>
-      </w:pPr>
-      <w:r>
-        <w:rPr>
-          <w:sz w:val="24"/>
-        </w:rPr>
-        <w:t>&lt;&lt;currentDate&gt;&gt;</w:t>
-      </w:r>
-    </w:p>
-    <w:p>
-      <w:pPr>
-        <w:rPr>
-          <w:sz w:val="24"/>
-        </w:rPr>
-      </w:pPr>
-    </w:p>
-    <w:p>
-      <w:pPr>
-        <w:tabs>
-          <w:tab w:val="left" w:pos="-1440"/>
-        </w:tabs>
-        <w:rPr>
-          <w:sz w:val="24"/>
-        </w:rPr>
-      </w:pPr>
-      <w:r>
-        <w:rPr>
-          <w:sz w:val="24"/>
-        </w:rPr>
-        <w:t>&lt;&lt;recipient&gt;&gt;</w:t>
-      </w:r>
-    </w:p>
-    <w:p>
-      <w:pPr>
-        <w:tabs>
-          <w:tab w:val="left" w:pos="-1440"/>
-        </w:tabs>
-        <w:rPr>
-          <w:sz w:val="24"/>
-        </w:rPr>
-      </w:pPr>
-      <w:r>
-        <w:rPr>
-          <w:sz w:val="24"/>
-        </w:rPr>
-        <w:t>&lt;&lt;recipientT</w:t>
-      </w:r>
-      <w:r>
-        <w:rPr>
-          <w:sz w:val="24"/>
-        </w:rPr>
-        <w:t>itle&gt;&gt;</w:t>
-      </w:r>
-    </w:p>
-    <w:p>
-      <w:pPr>
-        <w:tabs>
-          <w:tab w:val="left" w:pos="-1440"/>
-        </w:tabs>
-        <w:rPr>
-          <w:sz w:val="24"/>
-        </w:rPr>
-      </w:pPr>
-      <w:r>
-        <w:rPr>
-          <w:sz w:val="24"/>
-        </w:rPr>
-        <w:t>&lt;&lt;orgName&gt;&gt;</w:t>
-      </w:r>
-    </w:p>
-    <w:p>
-      <w:pPr>
-        <w:tabs>
-          <w:tab w:val="right" w:pos="9360"/>
-        </w:tabs>
-        <w:rPr>
-          <w:sz w:val="24"/>
-        </w:rPr>
-      </w:pPr>
-      <w:r>
-        <w:rPr>
-          <w:sz w:val="24"/>
-        </w:rPr>
-        <w:t>&lt;&lt;workAddr&gt;&gt;</w:t>
-      </w:r>
-    </w:p>
-    <w:p>
-      <w:pPr>
-        <w:tabs>
-          <w:tab w:val="right" w:pos="9360"/>
-        </w:tabs>
-        <w:rPr>
-          <w:sz w:val="24"/>
-        </w:rPr>
-      </w:pPr>
-      <w:r>
-        <w:rPr>
-          <w:sz w:val="24"/>
-        </w:rPr>
-        <w:t>&lt;&lt;CSZ&gt;&gt;</w:t>
+        <w:pStyle w:val="NormalWeb"/>
+        <w:spacing w:before="0" w:beforeAutospacing="0" w:after="0" w:afterAutospacing="0"/>
+      </w:pPr>
+      <w:r>
+        <w:t xml:space="preserve">Subject line: &lt;&lt;orgName&gt;&gt;: &lt;&lt;clientRefNo&gt;&gt; / SLW Ref: &lt;&lt;matterNo&gt;&gt; / </w:t>
+      </w:r>
+      <w:r>
+        <w:t>SLW</w:t>
+      </w:r>
+      <w:r>
+        <w:t xml:space="preserve"> Report Out: </w:t>
+      </w:r>
+      <w:r>
+        <w:t>Published Application</w:t>
+      </w:r>
+    </w:p>
+    <w:p>
+      <w:pPr>
+        <w:pStyle w:val="NormalWeb"/>
+        <w:spacing w:before="0" w:beforeAutospacing="0" w:after="0" w:afterAutospacing="0"/>
+      </w:pPr>
+    </w:p>
+    <w:p>
+      <w:pPr>
+        <w:pStyle w:val="NormalWeb"/>
+        <w:spacing w:before="0" w:beforeAutospacing="0" w:after="0" w:afterAutospacing="0"/>
+      </w:pPr>
+    </w:p>
+    <w:p>
+      <w:pPr>
+        <w:pStyle w:val="NormalWeb"/>
+        <w:spacing w:before="0" w:beforeAutospacing="0" w:after="0" w:afterAutospacing="0"/>
+      </w:pPr>
+    </w:p>
+    <w:p>
+      <w:pPr>
+        <w:pStyle w:val="NormalWeb"/>
+        <w:spacing w:before="0" w:beforeAutospacing="0" w:after="0" w:afterAutospacing="0"/>
+      </w:pPr>
+      <w:r>
+        <w:t>Body:</w:t>
+      </w:r>
+    </w:p>
+    <w:p>
+      <w:pPr>
+        <w:pStyle w:val="NormalWeb"/>
+        <w:spacing w:before="0" w:beforeAutospacing="0" w:after="0" w:afterAutospacing="0"/>
+      </w:pPr>
+    </w:p>
+    <w:p>
+      <w:pPr>
+        <w:pStyle w:val="NormalWeb"/>
+        <w:spacing w:before="0" w:beforeAutospacing="0" w:after="0" w:afterAutospacing="0"/>
+      </w:pPr>
+      <w:r>
+        <w:t>&lt;&lt;This.upperFirmName&gt;&gt;</w:t>
+      </w:r>
+    </w:p>
+    <w:p>
+      <w:pPr>
+        <w:pStyle w:val="NormalWeb"/>
+        <w:spacing w:before="0" w:beforeAutospacing="0" w:after="0" w:afterAutospacing="0"/>
+      </w:pPr>
+    </w:p>
+    <w:p>
+      <w:pPr>
+        <w:pStyle w:val="NormalWeb"/>
+        <w:spacing w:before="0" w:beforeAutospacing="0" w:after="0" w:afterAutospacing="0"/>
+      </w:pPr>
+      <w:r>
+        <w:t>&lt;&lt;This.WAName&gt;&gt; &lt;&lt;This.WAPhone&gt;</w:t>
+      </w:r>
+      <w:proofErr w:type="gramStart"/>
+      <w:r>
+        <w:t>&gt;  &lt;&lt;This.WAEmail</w:t>
+      </w:r>
+      <w:proofErr w:type="gramEnd"/>
+      <w:r>
+        <w:t>&gt;&gt;</w:t>
+      </w:r>
+    </w:p>
+    <w:p>
+      <w:pPr>
+        <w:pStyle w:val="NormalWeb"/>
+        <w:spacing w:before="0" w:beforeAutospacing="0" w:after="0" w:afterAutospacing="0"/>
+      </w:pPr>
+      <w:r>
+        <w:t>&lt;&lt;This.paraName&gt;&gt; &lt;&lt;This.paraPhone&gt;</w:t>
+      </w:r>
+      <w:proofErr w:type="gramStart"/>
+      <w:r>
+        <w:t>&gt;  &lt;&lt;This.paraEmail</w:t>
+      </w:r>
+      <w:proofErr w:type="gramEnd"/>
+      <w:r>
+        <w:t>&gt;&gt;</w:t>
       </w:r>
     </w:p>
     <w:p>
@@ -356,19 +223,6 @@
           <w:sz w:val="24"/>
         </w:rPr>
       </w:pPr>
-    </w:p>
-    <w:p>
-      <w:pPr>
-        <w:rPr>
-          <w:sz w:val="24"/>
-        </w:rPr>
-      </w:pPr>
-      <w:r>
-        <w:rPr>
-          <w:sz w:val="24"/>
-        </w:rPr>
-        <w:t xml:space="preserve">Dear </w:t>
-      </w:r>
       <w:r>
         <w:rPr>
           <w:noProof/>
@@ -376,31 +230,32 @@
         </w:rPr>
         <w:t>&lt;&lt;salutation&gt;&gt;</w:t>
       </w:r>
-      <w:r>
-        <w:rPr>
-          <w:sz w:val="24"/>
-        </w:rPr>
-        <w:t>:</w:t>
-      </w:r>
-    </w:p>
-    <w:p>
-      <w:pPr>
-        <w:rPr>
-          <w:sz w:val="24"/>
-        </w:rPr>
-      </w:pPr>
-    </w:p>
-    <w:p>
-      <w:pPr>
-        <w:rPr>
-          <w:sz w:val="24"/>
-        </w:rPr>
-      </w:pPr>
-      <w:r>
-        <w:rPr>
-          <w:sz w:val="24"/>
-        </w:rPr>
-        <w:t xml:space="preserve">The following represents new activity on the above mentioned matter. </w:t>
+    </w:p>
+    <w:p>
+      <w:pPr>
+        <w:rPr>
+          <w:sz w:val="24"/>
+        </w:rPr>
+      </w:pPr>
+      <w:r>
+        <w:rPr>
+          <w:sz w:val="24"/>
+        </w:rPr>
+        <w:t xml:space="preserve">The following represents new activity on the </w:t>
+      </w:r>
+      <w:proofErr w:type="gramStart"/>
+      <w:r>
+        <w:rPr>
+          <w:sz w:val="24"/>
+        </w:rPr>
+        <w:t>above mentioned</w:t>
+      </w:r>
+      <w:proofErr w:type="gramEnd"/>
+      <w:r>
+        <w:rPr>
+          <w:sz w:val="24"/>
+        </w:rPr>
+        <w:t xml:space="preserve"> matter. </w:t>
       </w:r>
     </w:p>
     <w:p>
@@ -456,7 +311,14 @@
         <w:rPr>
           <w:sz w:val="24"/>
         </w:rPr>
-        <w:t>&lt;&lt;pubDate&gt;&gt;</w:t>
+        <w:t>&lt;&lt;pubDate&gt;</w:t>
+      </w:r>
+      <w:proofErr w:type="gramStart"/>
+      <w:r>
+        <w:rPr>
+          <w:sz w:val="24"/>
+        </w:rPr>
+        <w:t>&gt;</w:t>
       </w:r>
       <w:r>
         <w:rPr>
@@ -471,7 +333,15 @@
           <w:noProof/>
           <w:sz w:val="24"/>
         </w:rPr>
-        <w:t xml:space="preserve">and assigned Publication Number </w:t>
+        <w:t>and</w:t>
+      </w:r>
+      <w:proofErr w:type="gramEnd"/>
+      <w:r>
+        <w:rPr>
+          <w:noProof/>
+          <w:sz w:val="24"/>
+        </w:rPr>
+        <w:t xml:space="preserve"> assigned Publication Number </w:t>
       </w:r>
       <w:r>
         <w:rPr>
@@ -554,127 +424,6 @@
         <w:t>.</w:t>
       </w:r>
     </w:p>
-    <w:p>
-      <w:pPr>
-        <w:rPr>
-          <w:sz w:val="24"/>
-        </w:rPr>
-      </w:pPr>
-    </w:p>
-    <w:p>
-      <w:pPr>
-        <w:rPr>
-          <w:sz w:val="24"/>
-        </w:rPr>
-      </w:pPr>
-      <w:r>
-        <w:rPr>
-          <w:sz w:val="24"/>
-        </w:rPr>
-        <w:t>Reported By:</w:t>
-      </w:r>
-    </w:p>
-    <w:p>
-      <w:pPr>
-        <w:rPr>
-          <w:sz w:val="24"/>
-        </w:rPr>
-      </w:pPr>
-    </w:p>
-    <w:p>
-      <w:pPr>
-        <w:rPr>
-          <w:sz w:val="24"/>
-        </w:rPr>
-      </w:pPr>
-    </w:p>
-    <w:p>
-      <w:pPr>
-        <w:rPr>
-          <w:sz w:val="24"/>
-        </w:rPr>
-      </w:pPr>
-      <w:r>
-        <w:rPr>
-          <w:color w:val="000000"/>
-          <w:sz w:val="24"/>
-        </w:rPr>
-        <w:t>&lt;&lt;cmgName&gt;&gt;</w:t>
-      </w:r>
-    </w:p>
-    <w:p>
-      <w:pPr>
-        <w:rPr>
-          <w:sz w:val="24"/>
-        </w:rPr>
-      </w:pPr>
-      <w:r>
-        <w:rPr>
-          <w:sz w:val="24"/>
-        </w:rPr>
-        <w:t>Case Management Assistant</w:t>
-      </w:r>
-    </w:p>
-    <w:p>
-      <w:pPr>
-        <w:rPr>
-          <w:sz w:val="24"/>
-        </w:rPr>
-      </w:pPr>
-    </w:p>
-    <w:p>
-      <w:pPr>
-        <w:rPr>
-          <w:sz w:val="24"/>
-        </w:rPr>
-      </w:pPr>
-      <w:r>
-        <w:rPr>
-          <w:sz w:val="24"/>
-        </w:rPr>
-        <w:t>Enclosure</w:t>
-      </w:r>
-    </w:p>
-    <w:p>
-      <w:pPr>
-        <w:rPr>
-          <w:sz w:val="24"/>
-        </w:rPr>
-      </w:pPr>
-    </w:p>
-    <w:tbl>
-      <w:tblPr>
-        <w:tblW w:w="9108" w:type="dxa"/>
-        <w:tblLayout w:type="fixed"/>
-        <w:tblLook w:val="01E0" w:firstRow="1" w:lastRow="1" w:firstColumn="1" w:lastColumn="1" w:noHBand="0" w:noVBand="0"/>
-      </w:tblPr>
-      <w:tblGrid>
-        <w:gridCol w:w="1188"/>
-        <w:gridCol w:w="7920"/>
-      </w:tblGrid>
-      <w:tr>
-        <w:tc>
-          <w:tcPr>
-            <w:tcW w:w="1188" w:type="dxa"/>
-          </w:tcPr>
-          <w:p>
-            <w:r>
-              <w:t>&lt;&lt;ccTag&gt;&gt;</w:t>
-            </w:r>
-          </w:p>
-        </w:tc>
-        <w:tc>
-          <w:tcPr>
-            <w:tcW w:w="7920" w:type="dxa"/>
-          </w:tcPr>
-          <w:p>
-            <w:r>
-              <w:t>&lt;&lt;ccName&gt;&gt;</w:t>
-            </w:r>
-          </w:p>
-        </w:tc>
-      </w:tr>
-    </w:tbl>
     <w:p>
       <w:pPr>
         <w:rPr>
@@ -764,6 +513,51 @@
     <w:lsdException w:name="Subtitle" w:qFormat="1"/>
     <w:lsdException w:name="Strong" w:qFormat="1"/>
     <w:lsdException w:name="Emphasis" w:qFormat="1"/>
+    <w:lsdException w:name="Normal (Web)" w:uiPriority="99"/>
+    <w:lsdException w:name="Normal Table" w:semiHidden="1" w:unhideWhenUsed="1"/>
+    <w:lsdException w:name="Table Simple 1" w:semiHidden="1" w:unhideWhenUsed="1"/>
+    <w:lsdException w:name="Table Simple 2" w:semiHidden="1" w:unhideWhenUsed="1"/>
+    <w:lsdException w:name="Table Simple 3" w:semiHidden="1" w:unhideWhenUsed="1"/>
+    <w:lsdException w:name="Table Classic 1" w:semiHidden="1" w:unhideWhenUsed="1"/>
+    <w:lsdException w:name="Table Classic 2" w:semiHidden="1" w:unhideWhenUsed="1"/>
+    <w:lsdException w:name="Table Classic 3" w:semiHidden="1" w:unhideWhenUsed="1"/>
+    <w:lsdException w:name="Table Classic 4" w:semiHidden="1" w:unhideWhenUsed="1"/>
+    <w:lsdException w:name="Table Colorful 1" w:semiHidden="1" w:unhideWhenUsed="1"/>
+    <w:lsdException w:name="Table Colorful 2" w:semiHidden="1" w:unhideWhenUsed="1"/>
+    <w:lsdException w:name="Table Colorful 3" w:semiHidden="1" w:unhideWhenUsed="1"/>
+    <w:lsdException w:name="Table Columns 1" w:semiHidden="1" w:unhideWhenUsed="1"/>
+    <w:lsdException w:name="Table Columns 2" w:semiHidden="1" w:unhideWhenUsed="1"/>
+    <w:lsdException w:name="Table Columns 3" w:semiHidden="1" w:unhideWhenUsed="1"/>
+    <w:lsdException w:name="Table Columns 4" w:semiHidden="1" w:unhideWhenUsed="1"/>
+    <w:lsdException w:name="Table Columns 5" w:semiHidden="1" w:unhideWhenUsed="1"/>
+    <w:lsdException w:name="Table Grid 1" w:semiHidden="1" w:unhideWhenUsed="1"/>
+    <w:lsdException w:name="Table Grid 2" w:semiHidden="1" w:unhideWhenUsed="1"/>
+    <w:lsdException w:name="Table Grid 3" w:semiHidden="1" w:unhideWhenUsed="1"/>
+    <w:lsdException w:name="Table Grid 4" w:semiHidden="1" w:unhideWhenUsed="1"/>
+    <w:lsdException w:name="Table Grid 5" w:semiHidden="1" w:unhideWhenUsed="1"/>
+    <w:lsdException w:name="Table Grid 6" w:semiHidden="1" w:unhideWhenUsed="1"/>
+    <w:lsdException w:name="Table Grid 7" w:semiHidden="1" w:unhideWhenUsed="1"/>
+    <w:lsdException w:name="Table Grid 8" w:semiHidden="1" w:unhideWhenUsed="1"/>
+    <w:lsdException w:name="Table List 1" w:semiHidden="1" w:unhideWhenUsed="1"/>
+    <w:lsdException w:name="Table List 2" w:semiHidden="1" w:unhideWhenUsed="1"/>
+    <w:lsdException w:name="Table List 3" w:semiHidden="1" w:unhideWhenUsed="1"/>
+    <w:lsdException w:name="Table List 4" w:semiHidden="1" w:unhideWhenUsed="1"/>
+    <w:lsdException w:name="Table List 5" w:semiHidden="1" w:unhideWhenUsed="1"/>
+    <w:lsdException w:name="Table List 6" w:semiHidden="1" w:unhideWhenUsed="1"/>
+    <w:lsdException w:name="Table List 7" w:semiHidden="1" w:unhideWhenUsed="1"/>
+    <w:lsdException w:name="Table List 8" w:semiHidden="1" w:unhideWhenUsed="1"/>
+    <w:lsdException w:name="Table 3D effects 1" w:semiHidden="1" w:unhideWhenUsed="1"/>
+    <w:lsdException w:name="Table 3D effects 2" w:semiHidden="1" w:unhideWhenUsed="1"/>
+    <w:lsdException w:name="Table 3D effects 3" w:semiHidden="1" w:unhideWhenUsed="1"/>
+    <w:lsdException w:name="Table Contemporary" w:semiHidden="1" w:unhideWhenUsed="1"/>
+    <w:lsdException w:name="Table Elegant" w:semiHidden="1" w:unhideWhenUsed="1"/>
+    <w:lsdException w:name="Table Professional" w:semiHidden="1" w:unhideWhenUsed="1"/>
+    <w:lsdException w:name="Table Subtle 1" w:semiHidden="1" w:unhideWhenUsed="1"/>
+    <w:lsdException w:name="Table Subtle 2" w:semiHidden="1" w:unhideWhenUsed="1"/>
+    <w:lsdException w:name="Table Web 1" w:semiHidden="1" w:unhideWhenUsed="1"/>
+    <w:lsdException w:name="Table Web 2" w:semiHidden="1" w:unhideWhenUsed="1"/>
+    <w:lsdException w:name="Table Web 3" w:semiHidden="1" w:unhideWhenUsed="1"/>
+    <w:lsdException w:name="Table Theme" w:semiHidden="1" w:unhideWhenUsed="1"/>
     <w:lsdException w:name="Placeholder Text" w:semiHidden="1" w:uiPriority="99"/>
     <w:lsdException w:name="No Spacing" w:uiPriority="1" w:qFormat="1"/>
     <w:lsdException w:name="Light Shading" w:uiPriority="60"/>
@@ -1001,11 +795,15 @@
   </w:style>
   <w:style w:type="character" w:default="1" w:styleId="DefaultParagraphFont">
     <w:name w:val="Default Paragraph Font"/>
+    <w:uiPriority w:val="1"/>
     <w:semiHidden/>
+    <w:unhideWhenUsed/>
   </w:style>
   <w:style w:type="table" w:default="1" w:styleId="TableNormal">
     <w:name w:val="Normal Table"/>
+    <w:uiPriority w:val="99"/>
     <w:semiHidden/>
+    <w:unhideWhenUsed/>
     <w:tblPr>
       <w:tblInd w:w="0" w:type="dxa"/>
       <w:tblCellMar>
@@ -1018,7 +816,9 @@
   </w:style>
   <w:style w:type="numbering" w:default="1" w:styleId="NoList">
     <w:name w:val="No List"/>
+    <w:uiPriority w:val="99"/>
     <w:semiHidden/>
+    <w:unhideWhenUsed/>
   </w:style>
   <w:style w:type="character" w:styleId="FootnoteReference">
     <w:name w:val="footnote reference"/>
@@ -1048,7 +848,6 @@
   </w:style>
   <w:style w:type="character" w:styleId="CommentReference">
     <w:name w:val="annotation reference"/>
-    <w:basedOn w:val="DefaultParagraphFont"/>
     <w:semiHidden/>
     <w:rsid w:val="003251AB"/>
     <w:rPr>
@@ -1094,6 +893,25 @@
     <w:link w:val="CommentText"/>
     <w:semiHidden/>
     <w:rsid w:val="003C5BC4"/>
+  </w:style>
+  <w:style w:type="paragraph" w:styleId="NormalWeb">
+    <w:name w:val="Normal (Web)"/>
+    <w:basedOn w:val="Normal"/>
+    <w:uiPriority w:val="99"/>
+    <w:unhideWhenUsed/>
+    <w:rsid w:val="00A25233"/>
+    <w:pPr>
+      <w:widowControl/>
+      <w:autoSpaceDE/>
+      <w:autoSpaceDN/>
+      <w:adjustRightInd/>
+      <w:spacing w:before="100" w:beforeAutospacing="1" w:after="100" w:afterAutospacing="1"/>
+    </w:pPr>
+    <w:rPr>
+      <w:rFonts w:ascii="Calibri" w:eastAsia="Calibri" w:hAnsi="Calibri" w:cs="Calibri"/>
+      <w:sz w:val="22"/>
+      <w:szCs w:val="22"/>
+    </w:rPr>
   </w:style>
 </w:styles>
 </file>

</xml_diff>